<commit_message>
Changes in Resume + 3 Application + 1 Rejected
</commit_message>
<xml_diff>
--- a/Baseline/Efraim Taranto - Resume.docx
+++ b/Baseline/Efraim Taranto - Resume.docx
@@ -29,6 +29,7 @@
     </w:p>
     <w:p>
       <w:pPr>
+        <w:spacing w:after="0"/>
         <w:rPr>
           <w:sz w:val="20"/>
           <w:szCs w:val="20"/>
@@ -91,12 +92,26 @@
     <w:p>
       <w:pPr>
         <w:pStyle w:val="Heading1"/>
+        <w:spacing w:before="0" w:after="0" w:line="168" w:lineRule="auto"/>
+        <w:rPr>
+          <w:sz w:val="24"/>
+          <w:szCs w:val="24"/>
+        </w:rPr>
+      </w:pPr>
+    </w:p>
+    <w:p>
+      <w:pPr>
+        <w:pStyle w:val="Heading1"/>
+        <w:spacing w:before="0" w:after="0"/>
       </w:pPr>
       <w:r>
         <w:t>Executive Profile</w:t>
       </w:r>
     </w:p>
     <w:p>
+      <w:pPr>
+        <w:spacing w:after="0"/>
+      </w:pPr>
       <w:r>
         <w:t>T</w:t>
       </w:r>
@@ -158,6 +173,17 @@
     <w:p>
       <w:pPr>
         <w:pStyle w:val="Heading1"/>
+        <w:spacing w:before="0" w:after="0" w:line="168" w:lineRule="auto"/>
+        <w:rPr>
+          <w:sz w:val="24"/>
+          <w:szCs w:val="24"/>
+        </w:rPr>
+      </w:pPr>
+    </w:p>
+    <w:p>
+      <w:pPr>
+        <w:pStyle w:val="Heading1"/>
+        <w:spacing w:before="0" w:after="0"/>
       </w:pPr>
       <w:r>
         <w:t>Core Capabilities</w:t>
@@ -249,6 +275,7 @@
     <w:p>
       <w:pPr>
         <w:pStyle w:val="ListParagraph"/>
+        <w:spacing w:after="0"/>
       </w:pPr>
       <w:r>
         <w:rPr>
@@ -264,6 +291,17 @@
     <w:p>
       <w:pPr>
         <w:pStyle w:val="Heading1"/>
+        <w:spacing w:before="0" w:after="0" w:line="168" w:lineRule="auto"/>
+        <w:rPr>
+          <w:sz w:val="24"/>
+          <w:szCs w:val="24"/>
+        </w:rPr>
+      </w:pPr>
+    </w:p>
+    <w:p>
+      <w:pPr>
+        <w:pStyle w:val="Heading1"/>
+        <w:spacing w:before="0" w:after="0"/>
         <w:rPr>
           <w:lang w:eastAsia="en-AU"/>
         </w:rPr>
@@ -346,6 +384,7 @@
     <w:p>
       <w:pPr>
         <w:pStyle w:val="ListParagraph"/>
+        <w:spacing w:after="0"/>
       </w:pPr>
       <w:r>
         <w:t>Consolidated program management reporting across multiple project platforms, reducing weekly reporting effort from approximately eight hours per project manager to a consolidated saving of around 60 project management hours per week.</w:t>
@@ -354,6 +393,17 @@
     <w:p>
       <w:pPr>
         <w:pStyle w:val="Heading1"/>
+        <w:spacing w:before="0" w:after="0" w:line="168" w:lineRule="auto"/>
+        <w:rPr>
+          <w:sz w:val="24"/>
+          <w:szCs w:val="24"/>
+        </w:rPr>
+      </w:pPr>
+    </w:p>
+    <w:p>
+      <w:pPr>
+        <w:pStyle w:val="Heading1"/>
+        <w:spacing w:before="0" w:after="0"/>
       </w:pPr>
       <w:r>
         <w:t>Professional Experience</w:t>
@@ -362,6 +412,7 @@
     <w:p>
       <w:pPr>
         <w:pStyle w:val="Heading2"/>
+        <w:spacing w:before="0" w:after="0"/>
       </w:pPr>
       <w:r>
         <w:t>Release Manager &amp; Technical Lead</w:t>
@@ -374,6 +425,9 @@
       </w:r>
     </w:p>
     <w:p>
+      <w:pPr>
+        <w:spacing w:after="0"/>
+      </w:pPr>
       <w:r>
         <w:t>Melbourne</w:t>
       </w:r>
@@ -400,6 +454,7 @@
           <w:ilvl w:val="0"/>
           <w:numId w:val="2"/>
         </w:numPr>
+        <w:spacing w:after="0"/>
       </w:pPr>
       <w:r>
         <w:t xml:space="preserve">Established </w:t>
@@ -495,6 +550,7 @@
           <w:ilvl w:val="0"/>
           <w:numId w:val="2"/>
         </w:numPr>
+        <w:spacing w:after="0"/>
       </w:pPr>
       <w:r>
         <w:t>Led hands-on optimi</w:t>
@@ -513,9 +569,9 @@
           <w:ilvl w:val="0"/>
           <w:numId w:val="2"/>
         </w:numPr>
-      </w:pPr>
-      <w:r>
-        <w:lastRenderedPageBreak/>
+        <w:spacing w:after="0"/>
+      </w:pPr>
+      <w:r>
         <w:t xml:space="preserve">Delivered the </w:t>
       </w:r>
       <w:r>
@@ -586,8 +642,10 @@
           <w:ilvl w:val="0"/>
           <w:numId w:val="2"/>
         </w:numPr>
-      </w:pPr>
-      <w:r>
+        <w:spacing w:after="0"/>
+      </w:pPr>
+      <w:r>
+        <w:lastRenderedPageBreak/>
         <w:t>Delivered the solution architecture for the Business LPG</w:t>
       </w:r>
       <w:r>
@@ -648,6 +706,7 @@
           <w:ilvl w:val="0"/>
           <w:numId w:val="2"/>
         </w:numPr>
+        <w:spacing w:after="0"/>
       </w:pPr>
       <w:r>
         <w:t xml:space="preserve">Provided hands-on </w:t>
@@ -679,7 +738,109 @@
     </w:p>
     <w:p>
       <w:pPr>
+        <w:pStyle w:val="ListParagraph"/>
+        <w:numPr>
+          <w:ilvl w:val="0"/>
+          <w:numId w:val="2"/>
+        </w:numPr>
+        <w:spacing w:after="0"/>
+      </w:pPr>
+      <w:r>
+        <w:t xml:space="preserve">Designed and </w:t>
+      </w:r>
+      <w:r>
+        <w:t>implemented</w:t>
+      </w:r>
+      <w:r>
+        <w:t xml:space="preserve"> a Power Apps solution</w:t>
+      </w:r>
+      <w:r>
+        <w:t>, supported by</w:t>
+      </w:r>
+      <w:r>
+        <w:t xml:space="preserve"> SharePoint Lists</w:t>
+      </w:r>
+      <w:r>
+        <w:t>,</w:t>
+      </w:r>
+      <w:r>
+        <w:t xml:space="preserve"> to replace </w:t>
+      </w:r>
+      <w:r>
+        <w:t xml:space="preserve">the </w:t>
+      </w:r>
+      <w:r>
+        <w:t>E</w:t>
+      </w:r>
+      <w:r>
+        <w:t>mail</w:t>
+      </w:r>
+      <w:r>
+        <w:t>/</w:t>
+      </w:r>
+      <w:r>
+        <w:t>Excel</w:t>
+      </w:r>
+      <w:r>
+        <w:t xml:space="preserve"> </w:t>
+      </w:r>
+      <w:r>
+        <w:t xml:space="preserve">based PPE procurement </w:t>
+      </w:r>
+      <w:r>
+        <w:t xml:space="preserve">process </w:t>
+      </w:r>
+      <w:r>
+        <w:t xml:space="preserve">for field operators. The </w:t>
+      </w:r>
+      <w:r>
+        <w:t>centralised</w:t>
+      </w:r>
+      <w:r>
+        <w:t xml:space="preserve"> workflow </w:t>
+      </w:r>
+      <w:r>
+        <w:t>streamlined</w:t>
+      </w:r>
+      <w:r>
+        <w:t xml:space="preserve"> order submission and approval</w:t>
+      </w:r>
+      <w:r>
+        <w:t xml:space="preserve">, </w:t>
+      </w:r>
+      <w:r>
+        <w:t>reduced</w:t>
+      </w:r>
+      <w:r>
+        <w:t xml:space="preserve"> administrative </w:t>
+      </w:r>
+      <w:r>
+        <w:t>burden</w:t>
+      </w:r>
+      <w:r>
+        <w:t xml:space="preserve">, and </w:t>
+      </w:r>
+      <w:r>
+        <w:t xml:space="preserve">accelerated </w:t>
+      </w:r>
+      <w:r>
+        <w:t>procurement processing.</w:t>
+      </w:r>
+    </w:p>
+    <w:p>
+      <w:pPr>
+        <w:pStyle w:val="Heading1"/>
+        <w:spacing w:before="0" w:after="0" w:line="168" w:lineRule="auto"/>
+        <w:rPr>
+          <w:sz w:val="24"/>
+          <w:szCs w:val="24"/>
+        </w:rPr>
+      </w:pPr>
+    </w:p>
+    <w:p>
+      <w:pPr>
         <w:pStyle w:val="Heading2"/>
+        <w:spacing w:before="0" w:after="0"/>
         <w:rPr>
           <w:lang w:eastAsia="en-AU"/>
         </w:rPr>
@@ -699,6 +860,7 @@
     </w:p>
     <w:p>
       <w:pPr>
+        <w:spacing w:after="0"/>
         <w:rPr>
           <w:lang w:eastAsia="en-AU"/>
         </w:rPr>
@@ -726,6 +888,7 @@
           <w:ilvl w:val="0"/>
           <w:numId w:val="3"/>
         </w:numPr>
+        <w:spacing w:after="0"/>
       </w:pPr>
       <w:r>
         <w:t xml:space="preserve">Established </w:t>
@@ -809,6 +972,7 @@
           <w:ilvl w:val="0"/>
           <w:numId w:val="3"/>
         </w:numPr>
+        <w:spacing w:after="0"/>
       </w:pPr>
       <w:r>
         <w:t>Led phase 1 of the BYOD project</w:t>
@@ -863,6 +1027,7 @@
           <w:ilvl w:val="0"/>
           <w:numId w:val="3"/>
         </w:numPr>
+        <w:spacing w:after="0"/>
       </w:pPr>
       <w:r>
         <w:t xml:space="preserve">Acted as Solution Architect to define the full integration of the BYOD project with the B2B </w:t>
@@ -893,6 +1058,7 @@
           <w:ilvl w:val="0"/>
           <w:numId w:val="3"/>
         </w:numPr>
+        <w:spacing w:after="0"/>
       </w:pPr>
       <w:r>
         <w:t>Supported the design and development of the first B2B integration between Salesforce Sales Cloud and an external customer procurement system</w:t>
@@ -918,7 +1084,18 @@
     </w:p>
     <w:p>
       <w:pPr>
+        <w:pStyle w:val="Heading1"/>
+        <w:spacing w:before="0" w:after="0" w:line="168" w:lineRule="auto"/>
+        <w:rPr>
+          <w:sz w:val="24"/>
+          <w:szCs w:val="24"/>
+        </w:rPr>
+      </w:pPr>
+    </w:p>
+    <w:p>
+      <w:pPr>
         <w:pStyle w:val="Heading2"/>
+        <w:spacing w:before="0" w:after="0"/>
         <w:rPr>
           <w:lang w:eastAsia="en-AU"/>
         </w:rPr>
@@ -938,6 +1115,7 @@
     </w:p>
     <w:p>
       <w:pPr>
+        <w:spacing w:after="0"/>
         <w:rPr>
           <w:lang w:eastAsia="en-AU"/>
         </w:rPr>
@@ -980,6 +1158,7 @@
           <w:ilvl w:val="0"/>
           <w:numId w:val="5"/>
         </w:numPr>
+        <w:spacing w:after="0"/>
       </w:pPr>
       <w:r>
         <w:t xml:space="preserve">Defined and implemented </w:t>
@@ -1077,6 +1256,7 @@
           <w:ilvl w:val="0"/>
           <w:numId w:val="5"/>
         </w:numPr>
+        <w:spacing w:after="0"/>
       </w:pPr>
       <w:r>
         <w:t xml:space="preserve">Using the defined testing framework, engineered an enterprise test reporting mechanism by customising HP Quality </w:t>
@@ -1105,6 +1285,7 @@
           <w:ilvl w:val="0"/>
           <w:numId w:val="5"/>
         </w:numPr>
+        <w:spacing w:after="0"/>
       </w:pPr>
       <w:r>
         <w:t>Coordinated testing cycles, including engagement with business users during user acceptance testing</w:t>
@@ -1158,6 +1339,7 @@
           <w:ilvl w:val="0"/>
           <w:numId w:val="5"/>
         </w:numPr>
+        <w:spacing w:after="0"/>
       </w:pPr>
       <w:r>
         <w:t xml:space="preserve">Built automated reporting tools that consolidated data from Microsoft Project, Microsoft Excel, HP Quality </w:t>
@@ -1185,7 +1367,18 @@
     </w:p>
     <w:p>
       <w:pPr>
+        <w:pStyle w:val="Heading1"/>
+        <w:spacing w:before="0" w:after="0" w:line="168" w:lineRule="auto"/>
+        <w:rPr>
+          <w:sz w:val="24"/>
+          <w:szCs w:val="24"/>
+        </w:rPr>
+      </w:pPr>
+    </w:p>
+    <w:p>
+      <w:pPr>
         <w:pStyle w:val="Heading2"/>
+        <w:spacing w:before="0" w:after="0"/>
         <w:rPr>
           <w:lang w:eastAsia="en-AU"/>
         </w:rPr>
@@ -1196,6 +1389,7 @@
     </w:p>
     <w:p>
       <w:pPr>
+        <w:spacing w:after="0"/>
         <w:rPr>
           <w:lang w:eastAsia="en-AU"/>
         </w:rPr>
@@ -1226,6 +1420,7 @@
           <w:ilvl w:val="0"/>
           <w:numId w:val="5"/>
         </w:numPr>
+        <w:spacing w:after="0"/>
       </w:pPr>
       <w:r>
         <w:t xml:space="preserve">Delivered senior technical consulting for Revolution IT/Wipro, customising HP Quality </w:t>
@@ -1254,6 +1449,7 @@
           <w:ilvl w:val="0"/>
           <w:numId w:val="5"/>
         </w:numPr>
+        <w:spacing w:after="0"/>
       </w:pPr>
       <w:r>
         <w:lastRenderedPageBreak/>
@@ -1267,6 +1463,7 @@
           <w:ilvl w:val="0"/>
           <w:numId w:val="5"/>
         </w:numPr>
+        <w:spacing w:after="0"/>
       </w:pPr>
       <w:r>
         <w:t xml:space="preserve">Led technical and functional consulting for </w:t>
@@ -1311,6 +1508,7 @@
           <w:ilvl w:val="0"/>
           <w:numId w:val="5"/>
         </w:numPr>
+        <w:spacing w:after="0"/>
       </w:pPr>
       <w:r>
         <w:t>Implemented Cognos BI and ETL solutions and delivered technical training across PeopleSoft and Cognos toolsets, strengthening reporting, integration, and internal technical capability.</w:t>
@@ -1323,6 +1521,7 @@
           <w:ilvl w:val="0"/>
           <w:numId w:val="5"/>
         </w:numPr>
+        <w:spacing w:after="0"/>
       </w:pPr>
       <w:r>
         <w:t>Built freelance software and database solutions using COBOL, PowerBuilder, Visual Basic, Gupta SQL Windows, Microsoft SQL Server, and Informix.</w:t>
@@ -1335,36 +1534,25 @@
           <w:ilvl w:val="0"/>
           <w:numId w:val="5"/>
         </w:numPr>
+        <w:spacing w:after="0"/>
       </w:pPr>
       <w:r>
         <w:t>Designed and developed a custom</w:t>
       </w:r>
       <w:r>
-        <w:t xml:space="preserve"> employee a</w:t>
-      </w:r>
-      <w:r>
-        <w:t xml:space="preserve">nd payroll </w:t>
-      </w:r>
-      <w:r>
-        <w:t>application for a small company in Venezuela</w:t>
+        <w:t xml:space="preserve"> employee and payroll application for a small company in Venezuela</w:t>
       </w:r>
       <w:r>
         <w:t>, enabling the business</w:t>
       </w:r>
       <w:r>
-        <w:t xml:space="preserve"> to </w:t>
-      </w:r>
-      <w:r>
-        <w:t xml:space="preserve">administer </w:t>
+        <w:t xml:space="preserve"> to administer </w:t>
       </w:r>
       <w:r>
         <w:t>employee records, calculate</w:t>
       </w:r>
       <w:r>
-        <w:t xml:space="preserve"> </w:t>
-      </w:r>
-      <w:r>
-        <w:t xml:space="preserve">weekly </w:t>
+        <w:t xml:space="preserve"> weekly </w:t>
       </w:r>
       <w:r>
         <w:t xml:space="preserve">payroll, manage </w:t>
@@ -1376,19 +1564,13 @@
         <w:t>-</w:t>
       </w:r>
       <w:r>
-        <w:t>c</w:t>
-      </w:r>
-      <w:r>
-        <w:t>ycle</w:t>
+        <w:t>cycle</w:t>
       </w:r>
       <w:r>
         <w:t xml:space="preserve"> inputs, and produce controlled payment outputs. The solution replaced</w:t>
       </w:r>
       <w:r>
-        <w:t xml:space="preserve"> manual </w:t>
-      </w:r>
-      <w:r>
-        <w:t>paper calculation</w:t>
+        <w:t xml:space="preserve"> manual paper calculation</w:t>
       </w:r>
       <w:r>
         <w:t xml:space="preserve"> and </w:t>
@@ -1409,6 +1591,17 @@
     <w:p>
       <w:pPr>
         <w:pStyle w:val="Heading1"/>
+        <w:spacing w:before="0" w:after="0" w:line="168" w:lineRule="auto"/>
+        <w:rPr>
+          <w:sz w:val="24"/>
+          <w:szCs w:val="24"/>
+        </w:rPr>
+      </w:pPr>
+    </w:p>
+    <w:p>
+      <w:pPr>
+        <w:pStyle w:val="Heading1"/>
+        <w:spacing w:before="0" w:after="0"/>
       </w:pPr>
       <w:r>
         <w:t xml:space="preserve">Community &amp; </w:t>
@@ -1420,6 +1613,7 @@
     <w:p>
       <w:pPr>
         <w:pStyle w:val="Heading2"/>
+        <w:spacing w:before="0" w:after="0"/>
       </w:pPr>
       <w:r>
         <w:t>Salesforce Architect, Developer &amp; Administrator</w:t>
@@ -1438,6 +1632,7 @@
           <w:ilvl w:val="0"/>
           <w:numId w:val="6"/>
         </w:numPr>
+        <w:spacing w:after="0"/>
       </w:pPr>
       <w:r>
         <w:t>Designed</w:t>
@@ -1452,15 +1647,7 @@
         <w:t>, and administered</w:t>
       </w:r>
       <w:r>
-        <w:t xml:space="preserve"> Salesforce NPSP, Sales Cloud, and Service Cloud solutions for community organisations including </w:t>
-      </w:r>
-      <w:proofErr w:type="spellStart"/>
-      <w:r>
-        <w:t>CCare</w:t>
-      </w:r>
-      <w:proofErr w:type="spellEnd"/>
-      <w:r>
-        <w:t xml:space="preserve">, Maccabi Victoria, NCJWA, Souper Kitchen, Beit Raphael, FOJAM, and the John Monash Foundation, tailoring each </w:t>
+        <w:t xml:space="preserve"> Salesforce NPSP, Sales Cloud, and Service Cloud solutions for community organisations including CCare, Maccabi Victoria, NCJWA, Souper Kitchen, Beit Raphael, FOJAM, and the John Monash Foundation, tailoring each </w:t>
       </w:r>
       <w:r>
         <w:t>implementation</w:t>
@@ -1482,17 +1669,10 @@
           <w:ilvl w:val="0"/>
           <w:numId w:val="6"/>
         </w:numPr>
-      </w:pPr>
-      <w:r>
-        <w:t xml:space="preserve">Built a Salesforce application for </w:t>
-      </w:r>
-      <w:proofErr w:type="spellStart"/>
-      <w:r>
-        <w:t>CCare</w:t>
-      </w:r>
-      <w:proofErr w:type="spellEnd"/>
-      <w:r>
-        <w:t xml:space="preserve"> that used recipient, household, and location data to calculate food parcel allocations and assign deliveries to volunteers for distribution.</w:t>
+        <w:spacing w:after="0"/>
+      </w:pPr>
+      <w:r>
+        <w:t>Built a Salesforce application for CCare that used recipient, household, and location data to calculate food parcel allocations and assign deliveries to volunteers for distribution.</w:t>
       </w:r>
     </w:p>
     <w:p>
@@ -1502,6 +1682,7 @@
           <w:ilvl w:val="0"/>
           <w:numId w:val="6"/>
         </w:numPr>
+        <w:spacing w:after="0"/>
       </w:pPr>
       <w:r>
         <w:t>Developed an Omni-Channel</w:t>
@@ -1553,6 +1734,7 @@
           <w:ilvl w:val="0"/>
           <w:numId w:val="6"/>
         </w:numPr>
+        <w:spacing w:after="0"/>
       </w:pPr>
       <w:r>
         <w:t xml:space="preserve">Coached and mentored </w:t>
@@ -1578,8 +1760,18 @@
     </w:p>
     <w:p>
       <w:pPr>
+        <w:pStyle w:val="Heading1"/>
+        <w:spacing w:before="0" w:after="0" w:line="168" w:lineRule="auto"/>
+        <w:rPr>
+          <w:sz w:val="24"/>
+          <w:szCs w:val="24"/>
+        </w:rPr>
+      </w:pPr>
+    </w:p>
+    <w:p>
+      <w:pPr>
         <w:pStyle w:val="Heading2"/>
-        <w:spacing w:before="360" w:after="80"/>
+        <w:spacing w:before="0" w:after="0"/>
         <w:rPr>
           <w:rFonts w:cstheme="minorBidi"/>
         </w:rPr>
@@ -1594,6 +1786,7 @@
     <w:p>
       <w:pPr>
         <w:pStyle w:val="Heading2"/>
+        <w:spacing w:before="0" w:after="0"/>
       </w:pPr>
       <w:r>
         <w:t>.NET Architect &amp; Full-Stack Developer (Oct 2015 – May 2016)</w:t>
@@ -1606,6 +1799,7 @@
           <w:ilvl w:val="0"/>
           <w:numId w:val="7"/>
         </w:numPr>
+        <w:spacing w:after="0"/>
       </w:pPr>
       <w:r>
         <w:t xml:space="preserve">Architected and developed a full-stack </w:t>
@@ -1624,6 +1818,7 @@
           <w:ilvl w:val="0"/>
           <w:numId w:val="7"/>
         </w:numPr>
+        <w:spacing w:after="0"/>
       </w:pPr>
       <w:r>
         <w:t xml:space="preserve">Built COM APIs to </w:t>
@@ -1659,6 +1854,17 @@
     <w:p>
       <w:pPr>
         <w:pStyle w:val="Heading1"/>
+        <w:spacing w:before="0" w:after="0" w:line="168" w:lineRule="auto"/>
+        <w:rPr>
+          <w:sz w:val="24"/>
+          <w:szCs w:val="24"/>
+        </w:rPr>
+      </w:pPr>
+    </w:p>
+    <w:p>
+      <w:pPr>
+        <w:pStyle w:val="Heading1"/>
+        <w:spacing w:before="0" w:after="0"/>
       </w:pPr>
       <w:r>
         <w:t>Education &amp; Professional Development</w:t>
@@ -1671,8 +1877,9 @@
           <w:ilvl w:val="0"/>
           <w:numId w:val="4"/>
         </w:numPr>
-      </w:pPr>
-      <w:proofErr w:type="gramStart"/>
+        <w:spacing w:after="0"/>
+        <w:ind w:left="360"/>
+      </w:pPr>
       <w:r>
         <w:t xml:space="preserve">Bachelor’s degree in </w:t>
       </w:r>
@@ -1688,22 +1895,34 @@
       <w:r>
         <w:t>ngineering</w:t>
       </w:r>
-      <w:proofErr w:type="gramEnd"/>
-    </w:p>
-    <w:p>
-      <w:pPr>
-        <w:ind w:left="360"/>
-      </w:pPr>
-      <w:r>
+      <w:r>
+        <w:t xml:space="preserve"> | </w:t>
+      </w:r>
+      <w:r>
+        <w:rPr>
+          <w:b/>
+          <w:bCs/>
+        </w:rPr>
         <w:t xml:space="preserve">Universidad </w:t>
       </w:r>
       <w:proofErr w:type="spellStart"/>
       <w:r>
+        <w:rPr>
+          <w:b/>
+          <w:bCs/>
+        </w:rPr>
         <w:t>Metropolitana</w:t>
       </w:r>
       <w:proofErr w:type="spellEnd"/>
       <w:r>
-        <w:t>, Venezuela | 1990–1995</w:t>
+        <w:rPr>
+          <w:b/>
+          <w:bCs/>
+        </w:rPr>
+        <w:t>, Venezuela</w:t>
+      </w:r>
+      <w:r>
+        <w:t xml:space="preserve"> | 1990–1995</w:t>
       </w:r>
     </w:p>
     <w:p>
@@ -1713,28 +1932,40 @@
           <w:ilvl w:val="0"/>
           <w:numId w:val="4"/>
         </w:numPr>
-      </w:pPr>
-      <w:r>
-        <w:t xml:space="preserve">Postgraduate </w:t>
-      </w:r>
-      <w:r>
-        <w:t xml:space="preserve">qualification </w:t>
-      </w:r>
-      <w:r>
-        <w:t>in Business Administration</w:t>
-      </w:r>
-    </w:p>
-    <w:p>
-      <w:pPr>
+        <w:spacing w:after="0"/>
         <w:ind w:left="360"/>
       </w:pPr>
       <w:r>
-        <w:t>Universidad Católica, Uruguay | 1996–1997</w:t>
+        <w:t>Postgraduate in Business Administration</w:t>
+      </w:r>
+      <w:r>
+        <w:t xml:space="preserve"> | </w:t>
+      </w:r>
+      <w:r>
+        <w:rPr>
+          <w:b/>
+          <w:bCs/>
+        </w:rPr>
+        <w:t>Universidad Católica, Uruguay</w:t>
+      </w:r>
+      <w:r>
+        <w:t xml:space="preserve"> | 1996–1997</w:t>
       </w:r>
     </w:p>
     <w:p>
       <w:pPr>
         <w:pStyle w:val="Heading1"/>
+        <w:spacing w:before="0" w:after="0" w:line="168" w:lineRule="auto"/>
+        <w:rPr>
+          <w:sz w:val="24"/>
+          <w:szCs w:val="24"/>
+        </w:rPr>
+      </w:pPr>
+    </w:p>
+    <w:p>
+      <w:pPr>
+        <w:pStyle w:val="Heading1"/>
+        <w:spacing w:before="0" w:after="0"/>
         <w:rPr>
           <w:lang w:eastAsia="en-AU"/>
         </w:rPr>
@@ -1753,6 +1984,7 @@
           <w:ilvl w:val="0"/>
           <w:numId w:val="4"/>
         </w:numPr>
+        <w:spacing w:after="0"/>
       </w:pPr>
       <w:r>
         <w:t xml:space="preserve">Bilingual </w:t>
@@ -1780,6 +2012,7 @@
           <w:ilvl w:val="0"/>
           <w:numId w:val="4"/>
         </w:numPr>
+        <w:spacing w:after="0"/>
         <w:rPr>
           <w:lang w:eastAsia="en-AU"/>
         </w:rPr>
@@ -1798,6 +2031,7 @@
           <w:ilvl w:val="0"/>
           <w:numId w:val="4"/>
         </w:numPr>
+        <w:spacing w:after="0"/>
         <w:rPr>
           <w:lang w:eastAsia="en-AU"/>
         </w:rPr>
@@ -1816,6 +2050,7 @@
           <w:ilvl w:val="0"/>
           <w:numId w:val="4"/>
         </w:numPr>
+        <w:spacing w:after="0"/>
         <w:rPr>
           <w:lang w:eastAsia="en-AU"/>
         </w:rPr>
@@ -1834,6 +2069,7 @@
           <w:ilvl w:val="0"/>
           <w:numId w:val="4"/>
         </w:numPr>
+        <w:spacing w:after="0"/>
       </w:pPr>
       <w:r>
         <w:rPr>
@@ -1855,6 +2091,155 @@
 <file path=word/numbering.xml><?xml version="1.0" encoding="utf-8"?>
 <w:numbering xmlns:wpc="http://schemas.microsoft.com/office/word/2010/wordprocessingCanvas" xmlns:cx="http://schemas.microsoft.com/office/drawing/2014/chartex" xmlns:cx1="http://schemas.microsoft.com/office/drawing/2015/9/8/chartex" xmlns:cx2="http://schemas.microsoft.com/office/drawing/2015/10/21/chartex" xmlns:cx3="http://schemas.microsoft.com/office/drawing/2016/5/9/chartex" xmlns:cx4="http://schemas.microsoft.com/office/drawing/2016/5/10/chartex" xmlns:cx5="http://schemas.microsoft.com/office/drawing/2016/5/11/chartex" xmlns:cx6="http://schemas.microsoft.com/office/drawing/2016/5/12/chartex" xmlns:cx7="http://schemas.microsoft.com/office/drawing/2016/5/13/chartex" xmlns:cx8="http://schemas.microsoft.com/office/drawing/2016/5/14/chartex" xmlns:mc="http://schemas.openxmlformats.org/markup-compatibility/2006" xmlns:aink="http://schemas.microsoft.com/office/drawing/2016/ink" xmlns:am3d="http://schemas.microsoft.com/office/drawing/2017/model3d" xmlns:o="urn:schemas-microsoft-com:office:office" xmlns:oel="http://schemas.microsoft.com/office/2019/extlst" xmlns:r="http://schemas.openxmlformats.org/officeDocument/2006/relationships" xmlns:m="http://schemas.openxmlformats.org/officeDocument/2006/math" xmlns:v="urn:schemas-microsoft-com:vml" xmlns:wp14="http://schemas.microsoft.com/office/word/2010/wordprocessingDrawing" xmlns:wp="http://schemas.openxmlformats.org/drawingml/2006/wordprocessingDrawing" xmlns:w10="urn:schemas-microsoft-com:office:word" xmlns:w="http://schemas.openxmlformats.org/wordprocessingml/2006/main" xmlns:w14="http://schemas.microsoft.com/office/word/2010/wordml" xmlns:w15="http://schemas.microsoft.com/office/word/2012/wordml" xmlns:w16cex="http://schemas.microsoft.com/office/word/2018/wordml/cex" xmlns:w16cid="http://schemas.microsoft.com/office/word/2016/wordml/cid" xmlns:w16="http://schemas.microsoft.com/office/word/2018/wordml" xmlns:w16du="http://schemas.microsoft.com/office/word/2023/wordml/word16du" xmlns:w16sdtdh="http://schemas.microsoft.com/office/word/2020/wordml/sdtdatahash" xmlns:w16sdtfl="http://schemas.microsoft.com/office/word/2024/wordml/sdtformatlock" xmlns:w16se="http://schemas.microsoft.com/office/word/2015/wordml/symex" xmlns:wpg="http://schemas.microsoft.com/office/word/2010/wordprocessingGroup" xmlns:wpi="http://schemas.microsoft.com/office/word/2010/wordprocessingInk" xmlns:wne="http://schemas.microsoft.com/office/word/2006/wordml" xmlns:wps="http://schemas.microsoft.com/office/word/2010/wordprocessingShape" mc:Ignorable="w14 w15 w16se w16cid w16 w16cex w16sdtdh w16sdtfl w16du wp14">
   <w:abstractNum w:abstractNumId="0" w15:restartNumberingAfterBreak="0">
+    <w:nsid w:val="16AA3F21"/>
+    <w:multiLevelType w:val="multilevel"/>
+    <w:tmpl w:val="4E3A761A"/>
+    <w:lvl w:ilvl="0">
+      <w:start w:val="1"/>
+      <w:numFmt w:val="bullet"/>
+      <w:lvlText w:val=""/>
+      <w:lvlJc w:val="left"/>
+      <w:pPr>
+        <w:tabs>
+          <w:tab w:val="num" w:pos="720"/>
+        </w:tabs>
+        <w:ind w:left="720" w:hanging="360"/>
+      </w:pPr>
+      <w:rPr>
+        <w:rFonts w:ascii="Symbol" w:hAnsi="Symbol" w:hint="default"/>
+        <w:sz w:val="20"/>
+      </w:rPr>
+    </w:lvl>
+    <w:lvl w:ilvl="1" w:tentative="1">
+      <w:start w:val="1"/>
+      <w:numFmt w:val="bullet"/>
+      <w:lvlText w:val="o"/>
+      <w:lvlJc w:val="left"/>
+      <w:pPr>
+        <w:tabs>
+          <w:tab w:val="num" w:pos="1440"/>
+        </w:tabs>
+        <w:ind w:left="1440" w:hanging="360"/>
+      </w:pPr>
+      <w:rPr>
+        <w:rFonts w:ascii="Courier New" w:hAnsi="Courier New" w:hint="default"/>
+        <w:sz w:val="20"/>
+      </w:rPr>
+    </w:lvl>
+    <w:lvl w:ilvl="2" w:tentative="1">
+      <w:start w:val="1"/>
+      <w:numFmt w:val="bullet"/>
+      <w:lvlText w:val=""/>
+      <w:lvlJc w:val="left"/>
+      <w:pPr>
+        <w:tabs>
+          <w:tab w:val="num" w:pos="2160"/>
+        </w:tabs>
+        <w:ind w:left="2160" w:hanging="360"/>
+      </w:pPr>
+      <w:rPr>
+        <w:rFonts w:ascii="Wingdings" w:hAnsi="Wingdings" w:hint="default"/>
+        <w:sz w:val="20"/>
+      </w:rPr>
+    </w:lvl>
+    <w:lvl w:ilvl="3" w:tentative="1">
+      <w:start w:val="1"/>
+      <w:numFmt w:val="bullet"/>
+      <w:lvlText w:val=""/>
+      <w:lvlJc w:val="left"/>
+      <w:pPr>
+        <w:tabs>
+          <w:tab w:val="num" w:pos="2880"/>
+        </w:tabs>
+        <w:ind w:left="2880" w:hanging="360"/>
+      </w:pPr>
+      <w:rPr>
+        <w:rFonts w:ascii="Wingdings" w:hAnsi="Wingdings" w:hint="default"/>
+        <w:sz w:val="20"/>
+      </w:rPr>
+    </w:lvl>
+    <w:lvl w:ilvl="4" w:tentative="1">
+      <w:start w:val="1"/>
+      <w:numFmt w:val="bullet"/>
+      <w:lvlText w:val=""/>
+      <w:lvlJc w:val="left"/>
+      <w:pPr>
+        <w:tabs>
+          <w:tab w:val="num" w:pos="3600"/>
+        </w:tabs>
+        <w:ind w:left="3600" w:hanging="360"/>
+      </w:pPr>
+      <w:rPr>
+        <w:rFonts w:ascii="Wingdings" w:hAnsi="Wingdings" w:hint="default"/>
+        <w:sz w:val="20"/>
+      </w:rPr>
+    </w:lvl>
+    <w:lvl w:ilvl="5" w:tentative="1">
+      <w:start w:val="1"/>
+      <w:numFmt w:val="bullet"/>
+      <w:lvlText w:val=""/>
+      <w:lvlJc w:val="left"/>
+      <w:pPr>
+        <w:tabs>
+          <w:tab w:val="num" w:pos="4320"/>
+        </w:tabs>
+        <w:ind w:left="4320" w:hanging="360"/>
+      </w:pPr>
+      <w:rPr>
+        <w:rFonts w:ascii="Wingdings" w:hAnsi="Wingdings" w:hint="default"/>
+        <w:sz w:val="20"/>
+      </w:rPr>
+    </w:lvl>
+    <w:lvl w:ilvl="6" w:tentative="1">
+      <w:start w:val="1"/>
+      <w:numFmt w:val="bullet"/>
+      <w:lvlText w:val=""/>
+      <w:lvlJc w:val="left"/>
+      <w:pPr>
+        <w:tabs>
+          <w:tab w:val="num" w:pos="5040"/>
+        </w:tabs>
+        <w:ind w:left="5040" w:hanging="360"/>
+      </w:pPr>
+      <w:rPr>
+        <w:rFonts w:ascii="Wingdings" w:hAnsi="Wingdings" w:hint="default"/>
+        <w:sz w:val="20"/>
+      </w:rPr>
+    </w:lvl>
+    <w:lvl w:ilvl="7" w:tentative="1">
+      <w:start w:val="1"/>
+      <w:numFmt w:val="bullet"/>
+      <w:lvlText w:val=""/>
+      <w:lvlJc w:val="left"/>
+      <w:pPr>
+        <w:tabs>
+          <w:tab w:val="num" w:pos="5760"/>
+        </w:tabs>
+        <w:ind w:left="5760" w:hanging="360"/>
+      </w:pPr>
+      <w:rPr>
+        <w:rFonts w:ascii="Wingdings" w:hAnsi="Wingdings" w:hint="default"/>
+        <w:sz w:val="20"/>
+      </w:rPr>
+    </w:lvl>
+    <w:lvl w:ilvl="8" w:tentative="1">
+      <w:start w:val="1"/>
+      <w:numFmt w:val="bullet"/>
+      <w:lvlText w:val=""/>
+      <w:lvlJc w:val="left"/>
+      <w:pPr>
+        <w:tabs>
+          <w:tab w:val="num" w:pos="6480"/>
+        </w:tabs>
+        <w:ind w:left="6480" w:hanging="360"/>
+      </w:pPr>
+      <w:rPr>
+        <w:rFonts w:ascii="Wingdings" w:hAnsi="Wingdings" w:hint="default"/>
+        <w:sz w:val="20"/>
+      </w:rPr>
+    </w:lvl>
+  </w:abstractNum>
+  <w:abstractNum w:abstractNumId="1" w15:restartNumberingAfterBreak="0">
     <w:nsid w:val="22DE448F"/>
     <w:multiLevelType w:val="multilevel"/>
     <w:tmpl w:val="B91047FE"/>
@@ -2003,7 +2388,7 @@
       </w:rPr>
     </w:lvl>
   </w:abstractNum>
-  <w:abstractNum w:abstractNumId="1" w15:restartNumberingAfterBreak="0">
+  <w:abstractNum w:abstractNumId="2" w15:restartNumberingAfterBreak="0">
     <w:nsid w:val="2C36491A"/>
     <w:multiLevelType w:val="multilevel"/>
     <w:tmpl w:val="73C61606"/>
@@ -2153,7 +2538,7 @@
       </w:rPr>
     </w:lvl>
   </w:abstractNum>
-  <w:abstractNum w:abstractNumId="2" w15:restartNumberingAfterBreak="0">
+  <w:abstractNum w:abstractNumId="3" w15:restartNumberingAfterBreak="0">
     <w:nsid w:val="2C376FE9"/>
     <w:multiLevelType w:val="multilevel"/>
     <w:tmpl w:val="31B8D192"/>
@@ -2302,7 +2687,7 @@
       </w:rPr>
     </w:lvl>
   </w:abstractNum>
-  <w:abstractNum w:abstractNumId="3" w15:restartNumberingAfterBreak="0">
+  <w:abstractNum w:abstractNumId="4" w15:restartNumberingAfterBreak="0">
     <w:nsid w:val="34167B9A"/>
     <w:multiLevelType w:val="multilevel"/>
     <w:tmpl w:val="13E6DAA8"/>
@@ -2451,7 +2836,156 @@
       </w:rPr>
     </w:lvl>
   </w:abstractNum>
-  <w:abstractNum w:abstractNumId="4" w15:restartNumberingAfterBreak="0">
+  <w:abstractNum w:abstractNumId="5" w15:restartNumberingAfterBreak="0">
+    <w:nsid w:val="45936137"/>
+    <w:multiLevelType w:val="multilevel"/>
+    <w:tmpl w:val="72F212AC"/>
+    <w:lvl w:ilvl="0">
+      <w:start w:val="1"/>
+      <w:numFmt w:val="bullet"/>
+      <w:lvlText w:val=""/>
+      <w:lvlJc w:val="left"/>
+      <w:pPr>
+        <w:tabs>
+          <w:tab w:val="num" w:pos="720"/>
+        </w:tabs>
+        <w:ind w:left="720" w:hanging="360"/>
+      </w:pPr>
+      <w:rPr>
+        <w:rFonts w:ascii="Symbol" w:hAnsi="Symbol" w:hint="default"/>
+        <w:sz w:val="20"/>
+      </w:rPr>
+    </w:lvl>
+    <w:lvl w:ilvl="1" w:tentative="1">
+      <w:start w:val="1"/>
+      <w:numFmt w:val="bullet"/>
+      <w:lvlText w:val="o"/>
+      <w:lvlJc w:val="left"/>
+      <w:pPr>
+        <w:tabs>
+          <w:tab w:val="num" w:pos="1440"/>
+        </w:tabs>
+        <w:ind w:left="1440" w:hanging="360"/>
+      </w:pPr>
+      <w:rPr>
+        <w:rFonts w:ascii="Courier New" w:hAnsi="Courier New" w:hint="default"/>
+        <w:sz w:val="20"/>
+      </w:rPr>
+    </w:lvl>
+    <w:lvl w:ilvl="2" w:tentative="1">
+      <w:start w:val="1"/>
+      <w:numFmt w:val="bullet"/>
+      <w:lvlText w:val=""/>
+      <w:lvlJc w:val="left"/>
+      <w:pPr>
+        <w:tabs>
+          <w:tab w:val="num" w:pos="2160"/>
+        </w:tabs>
+        <w:ind w:left="2160" w:hanging="360"/>
+      </w:pPr>
+      <w:rPr>
+        <w:rFonts w:ascii="Wingdings" w:hAnsi="Wingdings" w:hint="default"/>
+        <w:sz w:val="20"/>
+      </w:rPr>
+    </w:lvl>
+    <w:lvl w:ilvl="3" w:tentative="1">
+      <w:start w:val="1"/>
+      <w:numFmt w:val="bullet"/>
+      <w:lvlText w:val=""/>
+      <w:lvlJc w:val="left"/>
+      <w:pPr>
+        <w:tabs>
+          <w:tab w:val="num" w:pos="2880"/>
+        </w:tabs>
+        <w:ind w:left="2880" w:hanging="360"/>
+      </w:pPr>
+      <w:rPr>
+        <w:rFonts w:ascii="Wingdings" w:hAnsi="Wingdings" w:hint="default"/>
+        <w:sz w:val="20"/>
+      </w:rPr>
+    </w:lvl>
+    <w:lvl w:ilvl="4" w:tentative="1">
+      <w:start w:val="1"/>
+      <w:numFmt w:val="bullet"/>
+      <w:lvlText w:val=""/>
+      <w:lvlJc w:val="left"/>
+      <w:pPr>
+        <w:tabs>
+          <w:tab w:val="num" w:pos="3600"/>
+        </w:tabs>
+        <w:ind w:left="3600" w:hanging="360"/>
+      </w:pPr>
+      <w:rPr>
+        <w:rFonts w:ascii="Wingdings" w:hAnsi="Wingdings" w:hint="default"/>
+        <w:sz w:val="20"/>
+      </w:rPr>
+    </w:lvl>
+    <w:lvl w:ilvl="5" w:tentative="1">
+      <w:start w:val="1"/>
+      <w:numFmt w:val="bullet"/>
+      <w:lvlText w:val=""/>
+      <w:lvlJc w:val="left"/>
+      <w:pPr>
+        <w:tabs>
+          <w:tab w:val="num" w:pos="4320"/>
+        </w:tabs>
+        <w:ind w:left="4320" w:hanging="360"/>
+      </w:pPr>
+      <w:rPr>
+        <w:rFonts w:ascii="Wingdings" w:hAnsi="Wingdings" w:hint="default"/>
+        <w:sz w:val="20"/>
+      </w:rPr>
+    </w:lvl>
+    <w:lvl w:ilvl="6" w:tentative="1">
+      <w:start w:val="1"/>
+      <w:numFmt w:val="bullet"/>
+      <w:lvlText w:val=""/>
+      <w:lvlJc w:val="left"/>
+      <w:pPr>
+        <w:tabs>
+          <w:tab w:val="num" w:pos="5040"/>
+        </w:tabs>
+        <w:ind w:left="5040" w:hanging="360"/>
+      </w:pPr>
+      <w:rPr>
+        <w:rFonts w:ascii="Wingdings" w:hAnsi="Wingdings" w:hint="default"/>
+        <w:sz w:val="20"/>
+      </w:rPr>
+    </w:lvl>
+    <w:lvl w:ilvl="7" w:tentative="1">
+      <w:start w:val="1"/>
+      <w:numFmt w:val="bullet"/>
+      <w:lvlText w:val=""/>
+      <w:lvlJc w:val="left"/>
+      <w:pPr>
+        <w:tabs>
+          <w:tab w:val="num" w:pos="5760"/>
+        </w:tabs>
+        <w:ind w:left="5760" w:hanging="360"/>
+      </w:pPr>
+      <w:rPr>
+        <w:rFonts w:ascii="Wingdings" w:hAnsi="Wingdings" w:hint="default"/>
+        <w:sz w:val="20"/>
+      </w:rPr>
+    </w:lvl>
+    <w:lvl w:ilvl="8" w:tentative="1">
+      <w:start w:val="1"/>
+      <w:numFmt w:val="bullet"/>
+      <w:lvlText w:val=""/>
+      <w:lvlJc w:val="left"/>
+      <w:pPr>
+        <w:tabs>
+          <w:tab w:val="num" w:pos="6480"/>
+        </w:tabs>
+        <w:ind w:left="6480" w:hanging="360"/>
+      </w:pPr>
+      <w:rPr>
+        <w:rFonts w:ascii="Wingdings" w:hAnsi="Wingdings" w:hint="default"/>
+        <w:sz w:val="20"/>
+      </w:rPr>
+    </w:lvl>
+  </w:abstractNum>
+  <w:abstractNum w:abstractNumId="6" w15:restartNumberingAfterBreak="0">
     <w:nsid w:val="62F50B0B"/>
     <w:multiLevelType w:val="multilevel"/>
     <w:tmpl w:val="94A88D1E"/>
@@ -2600,7 +3134,7 @@
       </w:rPr>
     </w:lvl>
   </w:abstractNum>
-  <w:abstractNum w:abstractNumId="5" w15:restartNumberingAfterBreak="0">
+  <w:abstractNum w:abstractNumId="7" w15:restartNumberingAfterBreak="0">
     <w:nsid w:val="76847C60"/>
     <w:multiLevelType w:val="multilevel"/>
     <w:tmpl w:val="9D148AEE"/>
@@ -2749,7 +3283,7 @@
       </w:rPr>
     </w:lvl>
   </w:abstractNum>
-  <w:abstractNum w:abstractNumId="6" w15:restartNumberingAfterBreak="0">
+  <w:abstractNum w:abstractNumId="8" w15:restartNumberingAfterBreak="0">
     <w:nsid w:val="7C5A55EC"/>
     <w:multiLevelType w:val="multilevel"/>
     <w:tmpl w:val="209420BE"/>
@@ -2899,25 +3433,31 @@
     </w:lvl>
   </w:abstractNum>
   <w:num w:numId="1" w16cid:durableId="874199355">
+    <w:abstractNumId w:val="2"/>
+  </w:num>
+  <w:num w:numId="2" w16cid:durableId="525412382">
+    <w:abstractNumId w:val="7"/>
+  </w:num>
+  <w:num w:numId="3" w16cid:durableId="2144955152">
+    <w:abstractNumId w:val="4"/>
+  </w:num>
+  <w:num w:numId="4" w16cid:durableId="250550923">
+    <w:abstractNumId w:val="6"/>
+  </w:num>
+  <w:num w:numId="5" w16cid:durableId="435292832">
     <w:abstractNumId w:val="1"/>
   </w:num>
-  <w:num w:numId="2" w16cid:durableId="525412382">
-    <w:abstractNumId w:val="5"/>
+  <w:num w:numId="6" w16cid:durableId="1082414660">
+    <w:abstractNumId w:val="8"/>
   </w:num>
-  <w:num w:numId="3" w16cid:durableId="2144955152">
+  <w:num w:numId="7" w16cid:durableId="564220248">
     <w:abstractNumId w:val="3"/>
   </w:num>
-  <w:num w:numId="4" w16cid:durableId="250550923">
-    <w:abstractNumId w:val="4"/>
-  </w:num>
-  <w:num w:numId="5" w16cid:durableId="435292832">
+  <w:num w:numId="8" w16cid:durableId="524490674">
     <w:abstractNumId w:val="0"/>
   </w:num>
-  <w:num w:numId="6" w16cid:durableId="1082414660">
-    <w:abstractNumId w:val="6"/>
-  </w:num>
-  <w:num w:numId="7" w16cid:durableId="564220248">
-    <w:abstractNumId w:val="2"/>
+  <w:num w:numId="9" w16cid:durableId="1359232349">
+    <w:abstractNumId w:val="5"/>
   </w:num>
   <w:numIdMacAtCleanup w:val="7"/>
 </w:numbering>
@@ -3536,6 +4076,7 @@
   <w:style w:type="character" w:default="1" w:styleId="DefaultParagraphFont">
     <w:name w:val="Default Paragraph Font"/>
     <w:uiPriority w:val="1"/>
+    <w:semiHidden/>
     <w:unhideWhenUsed/>
   </w:style>
   <w:style w:type="table" w:default="1" w:styleId="TableNormal">

</xml_diff>

<commit_message>
2 Apllications + 3 calls
</commit_message>
<xml_diff>
--- a/Baseline/Efraim Taranto - Resume.docx
+++ b/Baseline/Efraim Taranto - Resume.docx
@@ -9,6 +9,30 @@
       <w:r>
         <w:t>Efraim Taranto</w:t>
       </w:r>
+      <w:r>
+        <w:t xml:space="preserve"> </w:t>
+      </w:r>
+      <w:r>
+        <w:tab/>
+      </w:r>
+      <w:r>
+        <w:tab/>
+      </w:r>
+      <w:r>
+        <w:tab/>
+      </w:r>
+      <w:r>
+        <w:tab/>
+      </w:r>
+      <w:r>
+        <w:tab/>
+      </w:r>
+      <w:r>
+        <w:tab/>
+      </w:r>
+      <w:r>
+        <w:tab/>
+      </w:r>
     </w:p>
     <w:p>
       <w:pPr>
@@ -25,6 +49,50 @@
       </w:r>
       <w:r>
         <w:t xml:space="preserve"> | Transformation</w:t>
+      </w:r>
+    </w:p>
+    <w:p>
+      <w:pPr>
+        <w:pStyle w:val="Title"/>
+        <w:rPr>
+          <w:rFonts w:eastAsiaTheme="minorHAnsi"/>
+          <w:spacing w:val="0"/>
+          <w:kern w:val="2"/>
+          <w:sz w:val="22"/>
+          <w:szCs w:val="22"/>
+        </w:rPr>
+      </w:pPr>
+      <w:r>
+        <w:rPr>
+          <w:rFonts w:eastAsiaTheme="minorHAnsi"/>
+          <w:b/>
+          <w:bCs/>
+          <w:spacing w:val="0"/>
+          <w:kern w:val="2"/>
+          <w:sz w:val="22"/>
+          <w:szCs w:val="22"/>
+        </w:rPr>
+        <w:t>Australian Citizen</w:t>
+      </w:r>
+      <w:r>
+        <w:rPr>
+          <w:rFonts w:eastAsiaTheme="minorHAnsi"/>
+          <w:spacing w:val="0"/>
+          <w:kern w:val="2"/>
+          <w:sz w:val="22"/>
+          <w:szCs w:val="22"/>
+        </w:rPr>
+        <w:t xml:space="preserve"> – Ormond, Victoria 320</w:t>
+      </w:r>
+      <w:r>
+        <w:rPr>
+          <w:rFonts w:eastAsiaTheme="minorHAnsi"/>
+          <w:spacing w:val="0"/>
+          <w:kern w:val="2"/>
+          <w:sz w:val="22"/>
+          <w:szCs w:val="22"/>
+        </w:rPr>
+        <w:t>4</w:t>
       </w:r>
     </w:p>
     <w:p>
@@ -74,20 +142,6 @@
           <w:t>https://www.linkedin.com/in/efraim-taranto-2306344</w:t>
         </w:r>
       </w:hyperlink>
-      <w:r>
-        <w:rPr>
-          <w:sz w:val="20"/>
-          <w:szCs w:val="20"/>
-        </w:rPr>
-        <w:t xml:space="preserve"> | Melbourne</w:t>
-      </w:r>
-      <w:r>
-        <w:rPr>
-          <w:sz w:val="20"/>
-          <w:szCs w:val="20"/>
-        </w:rPr>
-        <w:t>, VIC</w:t>
-      </w:r>
     </w:p>
     <w:p>
       <w:pPr>

</xml_diff>

<commit_message>
Certification and 4 applications
</commit_message>
<xml_diff>
--- a/Baseline/Efraim Taranto - Resume.docx
+++ b/Baseline/Efraim Taranto - Resume.docx
@@ -564,13 +564,8 @@
       <w:r>
         <w:t xml:space="preserve">and </w:t>
       </w:r>
-      <w:proofErr w:type="spellStart"/>
-      <w:r>
-        <w:t>Snyk</w:t>
-      </w:r>
-      <w:proofErr w:type="spellEnd"/>
-      <w:r>
-        <w:t xml:space="preserve"> compliance</w:t>
+      <w:r>
+        <w:t>Snyk compliance</w:t>
       </w:r>
       <w:r>
         <w:t xml:space="preserve"> checks.</w:t>
@@ -724,15 +719,7 @@
         <w:t>retention</w:t>
       </w:r>
       <w:r>
-        <w:t xml:space="preserve">, </w:t>
-      </w:r>
-      <w:proofErr w:type="spellStart"/>
-      <w:r>
-        <w:t>Agentforce</w:t>
-      </w:r>
-      <w:proofErr w:type="spellEnd"/>
-      <w:r>
-        <w:t xml:space="preserve"> for </w:t>
+        <w:t xml:space="preserve">, Agentforce for </w:t>
       </w:r>
       <w:r>
         <w:t>field sales</w:t>
@@ -993,13 +980,8 @@
         <w:t>scaled it</w:t>
       </w:r>
       <w:r>
-        <w:t xml:space="preserve"> to 50,000 concurrent connections using </w:t>
-      </w:r>
-      <w:proofErr w:type="spellStart"/>
-      <w:r>
-        <w:t>BlazeMeter</w:t>
-      </w:r>
-      <w:proofErr w:type="spellEnd"/>
+        <w:t xml:space="preserve"> to 50,000 concurrent connections using BlazeMeter</w:t>
+      </w:r>
       <w:r>
         <w:t>, validating</w:t>
       </w:r>
@@ -1233,15 +1215,7 @@
         <w:t xml:space="preserve"> and </w:t>
       </w:r>
       <w:r>
-        <w:t xml:space="preserve">integrated with HP Quality </w:t>
-      </w:r>
-      <w:proofErr w:type="spellStart"/>
-      <w:r>
-        <w:t>Center</w:t>
-      </w:r>
-      <w:proofErr w:type="spellEnd"/>
-      <w:r>
-        <w:t xml:space="preserve"> to execute </w:t>
+        <w:t xml:space="preserve">integrated with HP Quality Center to execute </w:t>
       </w:r>
       <w:r>
         <w:t xml:space="preserve">tests </w:t>
@@ -1273,13 +1247,8 @@
       <w:r>
         <w:t xml:space="preserve"> SAP IS/U, </w:t>
       </w:r>
-      <w:proofErr w:type="spellStart"/>
-      <w:r>
-        <w:t>WebMethods</w:t>
-      </w:r>
-      <w:proofErr w:type="spellEnd"/>
-      <w:r>
-        <w:t>,</w:t>
+      <w:r>
+        <w:t>WebMethods,</w:t>
       </w:r>
       <w:r>
         <w:t xml:space="preserve"> and Energy Gateway. </w:t>
@@ -1313,23 +1282,7 @@
         <w:spacing w:after="0"/>
       </w:pPr>
       <w:r>
-        <w:t xml:space="preserve">Using the defined testing framework, engineered an enterprise test reporting mechanism by customising HP Quality </w:t>
-      </w:r>
-      <w:proofErr w:type="spellStart"/>
-      <w:r>
-        <w:t>Center</w:t>
-      </w:r>
-      <w:proofErr w:type="spellEnd"/>
-      <w:r>
-        <w:t xml:space="preserve"> and integrating HP Quality </w:t>
-      </w:r>
-      <w:proofErr w:type="spellStart"/>
-      <w:r>
-        <w:t>Center</w:t>
-      </w:r>
-      <w:proofErr w:type="spellEnd"/>
-      <w:r>
-        <w:t xml:space="preserve"> and Microsoft APIs. The mechanism provided a daily testing progress dashboard that collected manual and automated testing results as well as defect tracking, giving internal and vendor project managers a real-time view to support program testing gates.</w:t>
+        <w:t>Using the defined testing framework, engineered an enterprise test reporting mechanism by customising HP Quality Center and integrating HP Quality Center and Microsoft APIs. The mechanism provided a daily testing progress dashboard that collected manual and automated testing results as well as defect tracking, giving internal and vendor project managers a real-time view to support program testing gates.</w:t>
       </w:r>
     </w:p>
     <w:p>
@@ -1354,15 +1307,7 @@
         <w:t xml:space="preserve">the </w:t>
       </w:r>
       <w:r>
-        <w:t xml:space="preserve">HP Quality </w:t>
-      </w:r>
-      <w:proofErr w:type="spellStart"/>
-      <w:r>
-        <w:t>Center</w:t>
-      </w:r>
-      <w:proofErr w:type="spellEnd"/>
-      <w:r>
-        <w:t xml:space="preserve"> foundation </w:t>
+        <w:t xml:space="preserve">HP Quality Center foundation </w:t>
       </w:r>
       <w:r>
         <w:t>structure of releases</w:t>
@@ -1398,13 +1343,8 @@
       <w:r>
         <w:t xml:space="preserve">Built automated reporting tools that consolidated data from Microsoft Project, Microsoft Excel, HP Quality </w:t>
       </w:r>
-      <w:proofErr w:type="spellStart"/>
-      <w:r>
-        <w:t>Center</w:t>
-      </w:r>
-      <w:proofErr w:type="spellEnd"/>
-      <w:r>
-        <w:t>,</w:t>
+      <w:r>
+        <w:t>Center,</w:t>
       </w:r>
       <w:r>
         <w:t xml:space="preserve"> and Jira to produce daily development and testing progress reports</w:t>
@@ -1477,23 +1417,7 @@
         <w:spacing w:after="0"/>
       </w:pPr>
       <w:r>
-        <w:t xml:space="preserve">Delivered senior technical consulting for Revolution IT/Wipro, customising HP Quality </w:t>
-      </w:r>
-      <w:proofErr w:type="spellStart"/>
-      <w:r>
-        <w:t>Center</w:t>
-      </w:r>
-      <w:proofErr w:type="spellEnd"/>
-      <w:r>
-        <w:t xml:space="preserve"> for multiple clients, implementing test automation suites, and delivering HP Quality </w:t>
-      </w:r>
-      <w:proofErr w:type="spellStart"/>
-      <w:r>
-        <w:t>Center</w:t>
-      </w:r>
-      <w:proofErr w:type="spellEnd"/>
-      <w:r>
-        <w:t xml:space="preserve"> and HP UFT training for end users and technical teams.</w:t>
+        <w:t>Delivered senior technical consulting for Revolution IT/Wipro, customising HP Quality Center for multiple clients, implementing test automation suites, and delivering HP Quality Center and HP UFT training for end users and technical teams.</w:t>
       </w:r>
     </w:p>
     <w:p>
@@ -1520,39 +1444,7 @@
         <w:spacing w:after="0"/>
       </w:pPr>
       <w:r>
-        <w:t xml:space="preserve">Led technical and functional consulting for </w:t>
-      </w:r>
-      <w:proofErr w:type="spellStart"/>
-      <w:r>
-        <w:t>Quanam</w:t>
-      </w:r>
-      <w:proofErr w:type="spellEnd"/>
-      <w:r>
-        <w:t xml:space="preserve"> PeopleSoft implementations across ERP, CRM, inventory, order management, and project costing, integrating PeopleSoft and </w:t>
-      </w:r>
-      <w:proofErr w:type="spellStart"/>
-      <w:r>
-        <w:t>Vantive</w:t>
-      </w:r>
-      <w:proofErr w:type="spellEnd"/>
-      <w:r>
-        <w:t xml:space="preserve"> with legacy systems using IBM MQSeries and customising solutions with </w:t>
-      </w:r>
-      <w:proofErr w:type="spellStart"/>
-      <w:r>
-        <w:t>PeopleCode</w:t>
-      </w:r>
-      <w:proofErr w:type="spellEnd"/>
-      <w:r>
-        <w:t xml:space="preserve">, SQR, Application Engine, and </w:t>
-      </w:r>
-      <w:proofErr w:type="spellStart"/>
-      <w:r>
-        <w:t>nVision</w:t>
-      </w:r>
-      <w:proofErr w:type="spellEnd"/>
-      <w:r>
-        <w:t>.</w:t>
+        <w:t>Led technical and functional consulting for Quanam PeopleSoft implementations across ERP, CRM, inventory, order management, and project costing, integrating PeopleSoft and Vantive with legacy systems using IBM MQSeries and customising solutions with PeopleCode, SQR, Application Engine, and nVision.</w:t>
       </w:r>
     </w:p>
     <w:p>
@@ -1957,23 +1849,7 @@
           <w:b/>
           <w:bCs/>
         </w:rPr>
-        <w:t xml:space="preserve">Universidad </w:t>
-      </w:r>
-      <w:proofErr w:type="spellStart"/>
-      <w:r>
-        <w:rPr>
-          <w:b/>
-          <w:bCs/>
-        </w:rPr>
-        <w:t>Metropolitana</w:t>
-      </w:r>
-      <w:proofErr w:type="spellEnd"/>
-      <w:r>
-        <w:rPr>
-          <w:b/>
-          <w:bCs/>
-        </w:rPr>
-        <w:t>, Venezuela</w:t>
+        <w:t>Universidad Metropolitana, Venezuela</w:t>
       </w:r>
       <w:r>
         <w:t xml:space="preserve"> | 1990–1995</w:t>
@@ -2039,24 +1915,21 @@
           <w:numId w:val="4"/>
         </w:numPr>
         <w:spacing w:after="0"/>
-      </w:pPr>
-      <w:r>
-        <w:t xml:space="preserve">Bilingual </w:t>
-      </w:r>
-      <w:r>
-        <w:t>proficiency</w:t>
-      </w:r>
-      <w:r>
-        <w:t>: Spanish native</w:t>
-      </w:r>
-      <w:r>
-        <w:t>,</w:t>
-      </w:r>
-      <w:r>
-        <w:t xml:space="preserve"> English</w:t>
-      </w:r>
-      <w:r>
-        <w:t xml:space="preserve"> professional</w:t>
+        <w:rPr>
+          <w:lang w:eastAsia="en-AU"/>
+        </w:rPr>
+      </w:pPr>
+      <w:r>
+        <w:rPr>
+          <w:lang w:eastAsia="en-AU"/>
+        </w:rPr>
+        <w:t xml:space="preserve">Salesforce </w:t>
+      </w:r>
+      <w:r>
+        <w:rPr>
+          <w:lang w:eastAsia="en-AU"/>
+        </w:rPr>
+        <w:t>Platform Administrator</w:t>
       </w:r>
     </w:p>
     <w:p>
@@ -2075,7 +1948,7 @@
         <w:rPr>
           <w:lang w:eastAsia="en-AU"/>
         </w:rPr>
-        <w:t>PRINCE2</w:t>
+        <w:t>Claude Code</w:t>
       </w:r>
     </w:p>
     <w:p>
@@ -2094,7 +1967,7 @@
         <w:rPr>
           <w:lang w:eastAsia="en-AU"/>
         </w:rPr>
-        <w:t>ISTQB</w:t>
+        <w:t>PRINCE2</w:t>
       </w:r>
     </w:p>
     <w:p>
@@ -2113,7 +1986,7 @@
         <w:rPr>
           <w:lang w:eastAsia="en-AU"/>
         </w:rPr>
-        <w:t>JB Leadership Program</w:t>
+        <w:t>ISTQB</w:t>
       </w:r>
     </w:p>
     <w:p>
@@ -2124,13 +1997,40 @@
           <w:numId w:val="4"/>
         </w:numPr>
         <w:spacing w:after="0"/>
-      </w:pPr>
-      <w:r>
         <w:rPr>
           <w:lang w:eastAsia="en-AU"/>
         </w:rPr>
-        <w:t>Salesforce Trailhead Ranger</w:t>
-      </w:r>
+      </w:pPr>
+      <w:r>
+        <w:rPr>
+          <w:lang w:eastAsia="en-AU"/>
+        </w:rPr>
+        <w:t>JB Leadership Program</w:t>
+      </w:r>
+    </w:p>
+    <w:p>
+      <w:pPr>
+        <w:pStyle w:val="ListParagraph"/>
+        <w:numPr>
+          <w:ilvl w:val="0"/>
+          <w:numId w:val="4"/>
+        </w:numPr>
+        <w:spacing w:after="0"/>
+      </w:pPr>
+      <w:r>
+        <w:t>Bilingual proficiency: Spanish native, English professional</w:t>
+      </w:r>
+    </w:p>
+    <w:p>
+      <w:pPr>
+        <w:pStyle w:val="ListParagraph"/>
+        <w:numPr>
+          <w:ilvl w:val="0"/>
+          <w:numId w:val="0"/>
+        </w:numPr>
+        <w:spacing w:after="0"/>
+        <w:ind w:left="720"/>
+      </w:pPr>
     </w:p>
     <w:sectPr>
       <w:pgSz w:w="11906" w:h="16838"/>
@@ -4130,7 +4030,6 @@
   <w:style w:type="character" w:default="1" w:styleId="DefaultParagraphFont">
     <w:name w:val="Default Paragraph Font"/>
     <w:uiPriority w:val="1"/>
-    <w:semiHidden/>
     <w:unhideWhenUsed/>
   </w:style>
   <w:style w:type="table" w:default="1" w:styleId="TableNormal">

</xml_diff>